<commit_message>
fix: correct Kishore S roll number (CH.SC.U4CSE24222) in PPTX + Thank You typo; add deploy URLs to report
</commit_message>
<xml_diff>
--- a/Quantum_Optimization_Agri_Supply_Chain_Report.docx
+++ b/Quantum_Optimization_Agri_Supply_Chain_Report.docx
@@ -30,6 +30,60 @@
         <w:t>Capstone Project Technical Report &amp; System Specification</w:t>
         <w:br/>
         <w:t>Farm-to-Market Logistics, Produce Decay Minimization &amp; QUBO-QAOA Algorithm Engine</w:t>
+      </w:r>
+    </w:p>
+    <w:p>
+      <w:pPr>
+        <w:spacing w:before="200"/>
+        <w:jc w:val="center"/>
+      </w:pPr>
+      <w:r>
+        <w:rPr>
+          <w:rFonts w:ascii="Arial" w:hAnsi="Arial"/>
+          <w:b/>
+          <w:color w:val="0F172A"/>
+          <w:sz w:val="24"/>
+        </w:rPr>
+        <w:t>Team: Kuantum</w:t>
+      </w:r>
+    </w:p>
+    <w:p>
+      <w:pPr>
+        <w:jc w:val="center"/>
+      </w:pPr>
+      <w:r>
+        <w:rPr>
+          <w:rFonts w:ascii="Calibri" w:hAnsi="Calibri"/>
+          <w:color w:val="222222"/>
+          <w:sz w:val="22"/>
+        </w:rPr>
+        <w:t>Saikrishna N   (CH.SC.U4CSE24244)</w:t>
+      </w:r>
+      <w:r>
+        <w:t xml:space="preserve">     |     </w:t>
+      </w:r>
+      <w:r>
+        <w:rPr>
+          <w:rFonts w:ascii="Calibri" w:hAnsi="Calibri"/>
+          <w:color w:val="222222"/>
+          <w:sz w:val="22"/>
+        </w:rPr>
+        <w:t>Kishore S   (CH.SC.U4CSE24222)</w:t>
+      </w:r>
+    </w:p>
+    <w:p>
+      <w:pPr>
+        <w:spacing w:before="80"/>
+        <w:jc w:val="center"/>
+      </w:pPr>
+      <w:r>
+        <w:rPr>
+          <w:rFonts w:ascii="Calibri" w:hAnsi="Calibri"/>
+          <w:i/>
+          <w:color w:val="0284C7"/>
+          <w:sz w:val="20"/>
+        </w:rPr>
+        <w:t>Live Demo: https://kuantum-app.onrender.com  |  API: https://kuantum-api.onrender.com</w:t>
       </w:r>
     </w:p>
     <w:p>
@@ -858,7 +912,51 @@
           <w:color w:val="0369A1"/>
           <w:sz w:val="25"/>
         </w:rPr>
-        <w:t>7.1 Frontend Architecture &amp; Design Philosophy</w:t>
+        <w:t>7.1 Deployment &amp; Live URLs</w:t>
+      </w:r>
+    </w:p>
+    <w:p>
+      <w:r>
+        <w:t>The system is live on Render cloud platform:</w:t>
+      </w:r>
+    </w:p>
+    <w:p>
+      <w:pPr>
+        <w:pStyle w:val="ListBullet"/>
+      </w:pPr>
+      <w:r>
+        <w:t>Frontend Web App: https://kuantum-app.onrender.com</w:t>
+      </w:r>
+    </w:p>
+    <w:p>
+      <w:pPr>
+        <w:pStyle w:val="ListBullet"/>
+      </w:pPr>
+      <w:r>
+        <w:t>Backend FastAPI Server: https://kuantum-api.onrender.com</w:t>
+      </w:r>
+    </w:p>
+    <w:p>
+      <w:pPr>
+        <w:pStyle w:val="ListBullet"/>
+      </w:pPr>
+      <w:r>
+        <w:t>API Health Check: https://kuantum-api.onrender.com/api/health</w:t>
+      </w:r>
+    </w:p>
+    <w:p>
+      <w:pPr>
+        <w:keepNext/>
+        <w:spacing w:before="280" w:after="80"/>
+      </w:pPr>
+      <w:r>
+        <w:rPr>
+          <w:rFonts w:ascii="Arial" w:hAnsi="Arial"/>
+          <w:b/>
+          <w:color w:val="0369A1"/>
+          <w:sz w:val="25"/>
+        </w:rPr>
+        <w:t>7.2 Frontend Architecture &amp; Design Philosophy</w:t>
       </w:r>
     </w:p>
     <w:p>
@@ -878,7 +976,7 @@
           <w:color w:val="0369A1"/>
           <w:sz w:val="25"/>
         </w:rPr>
-        <w:t>7.2 Tab Navigation &amp; Interface Modules</w:t>
+        <w:t>7.3 Tab Navigation &amp; Interface Modules</w:t>
       </w:r>
     </w:p>
     <w:p>

</xml_diff>